<commit_message>
added processing in chunks for large files
</commit_message>
<xml_diff>
--- a/Instructions.docx
+++ b/Instructions.docx
@@ -1,6 +1,6 @@
 
 <file path=word/document.xml><?xml version="1.0" encoding="utf-8"?>
-<w:document xmlns:wpc="http://schemas.microsoft.com/office/word/2010/wordprocessingCanvas" xmlns:cx="http://schemas.microsoft.com/office/drawing/2014/chartex" xmlns:cx1="http://schemas.microsoft.com/office/drawing/2015/9/8/chartex" xmlns:mc="http://schemas.openxmlformats.org/markup-compatibility/2006" xmlns:o="urn:schemas-microsoft-com:office:office" xmlns:r="http://schemas.openxmlformats.org/officeDocument/2006/relationships" xmlns:m="http://schemas.openxmlformats.org/officeDocument/2006/math" xmlns:v="urn:schemas-microsoft-com:vml" xmlns:wp14="http://schemas.microsoft.com/office/word/2010/wordprocessingDrawing" xmlns:wp="http://schemas.openxmlformats.org/drawingml/2006/wordprocessingDrawing" xmlns:w10="urn:schemas-microsoft-com:office:word" xmlns:w="http://schemas.openxmlformats.org/wordprocessingml/2006/main" xmlns:w14="http://schemas.microsoft.com/office/word/2010/wordml" xmlns:w15="http://schemas.microsoft.com/office/word/2012/wordml" xmlns:w16se="http://schemas.microsoft.com/office/word/2015/wordml/symex" xmlns:wpg="http://schemas.microsoft.com/office/word/2010/wordprocessingGroup" xmlns:wpi="http://schemas.microsoft.com/office/word/2010/wordprocessingInk" xmlns:wne="http://schemas.microsoft.com/office/word/2006/wordml" xmlns:wps="http://schemas.microsoft.com/office/word/2010/wordprocessingShape" mc:Ignorable="w14 w15 w16se wp14">
+<w:document xmlns:wpc="http://schemas.microsoft.com/office/word/2010/wordprocessingCanvas" xmlns:cx="http://schemas.microsoft.com/office/drawing/2014/chartex" xmlns:cx1="http://schemas.microsoft.com/office/drawing/2015/9/8/chartex" xmlns:cx2="http://schemas.microsoft.com/office/drawing/2015/10/21/chartex" xmlns:cx3="http://schemas.microsoft.com/office/drawing/2016/5/9/chartex" xmlns:cx4="http://schemas.microsoft.com/office/drawing/2016/5/10/chartex" xmlns:cx5="http://schemas.microsoft.com/office/drawing/2016/5/11/chartex" xmlns:cx6="http://schemas.microsoft.com/office/drawing/2016/5/12/chartex" xmlns:cx7="http://schemas.microsoft.com/office/drawing/2016/5/13/chartex" xmlns:cx8="http://schemas.microsoft.com/office/drawing/2016/5/14/chartex" xmlns:mc="http://schemas.openxmlformats.org/markup-compatibility/2006" xmlns:aink="http://schemas.microsoft.com/office/drawing/2016/ink" xmlns:am3d="http://schemas.microsoft.com/office/drawing/2017/model3d" xmlns:o="urn:schemas-microsoft-com:office:office" xmlns:oel="http://schemas.microsoft.com/office/2019/extlst" xmlns:r="http://schemas.openxmlformats.org/officeDocument/2006/relationships" xmlns:m="http://schemas.openxmlformats.org/officeDocument/2006/math" xmlns:v="urn:schemas-microsoft-com:vml" xmlns:wp14="http://schemas.microsoft.com/office/word/2010/wordprocessingDrawing" xmlns:wp="http://schemas.openxmlformats.org/drawingml/2006/wordprocessingDrawing" xmlns:w10="urn:schemas-microsoft-com:office:word" xmlns:w="http://schemas.openxmlformats.org/wordprocessingml/2006/main" xmlns:w14="http://schemas.microsoft.com/office/word/2010/wordml" xmlns:w15="http://schemas.microsoft.com/office/word/2012/wordml" xmlns:w16cex="http://schemas.microsoft.com/office/word/2018/wordml/cex" xmlns:w16cid="http://schemas.microsoft.com/office/word/2016/wordml/cid" xmlns:w16="http://schemas.microsoft.com/office/word/2018/wordml" xmlns:w16du="http://schemas.microsoft.com/office/word/2023/wordml/word16du" xmlns:w16sdtdh="http://schemas.microsoft.com/office/word/2020/wordml/sdtdatahash" xmlns:w16se="http://schemas.microsoft.com/office/word/2015/wordml/symex" xmlns:wpg="http://schemas.microsoft.com/office/word/2010/wordprocessingGroup" xmlns:wpi="http://schemas.microsoft.com/office/word/2010/wordprocessingInk" xmlns:wne="http://schemas.microsoft.com/office/word/2006/wordml" xmlns:wps="http://schemas.microsoft.com/office/word/2010/wordprocessingShape" mc:Ignorable="w14 w15 w16se w16cid w16 w16cex w16sdtdh w16du wp14">
   <w:body>
     <w:p>
       <w:pPr>
@@ -11,23 +11,13 @@
           <w:szCs w:val="28"/>
         </w:rPr>
       </w:pPr>
-      <w:proofErr w:type="spellStart"/>
       <w:r>
         <w:rPr>
           <w:b/>
           <w:sz w:val="28"/>
           <w:szCs w:val="28"/>
         </w:rPr>
-        <w:t>Minke</w:t>
-      </w:r>
-      <w:proofErr w:type="spellEnd"/>
-      <w:r>
-        <w:rPr>
-          <w:b/>
-          <w:sz w:val="28"/>
-          <w:szCs w:val="28"/>
-        </w:rPr>
-        <w:t xml:space="preserve"> Whale detector instructions</w:t>
+        <w:t>Minke Whale detector instructions</w:t>
       </w:r>
     </w:p>
     <w:p>
@@ -279,7 +269,7 @@
           <w:noProof/>
         </w:rPr>
         <w:drawing>
-          <wp:inline distT="0" distB="0" distL="0" distR="0">
+          <wp:inline distT="0" distB="0" distL="0" distR="0" wp14:anchorId="6B58DC99" wp14:editId="4B13BDB0">
             <wp:extent cx="4086062" cy="2343150"/>
             <wp:effectExtent l="0" t="0" r="0" b="0"/>
             <wp:docPr id="7" name="Picture 7" descr="F:\NOAA_Laptop_backup\2024-08-12\Documents\GitHub\minke-whale-detector\images\download_repo_zip.png"/>
@@ -386,7 +376,7 @@
           <w:color w:val="000000"/>
         </w:rPr>
         <w:drawing>
-          <wp:inline distT="0" distB="0" distL="0" distR="0">
+          <wp:inline distT="0" distB="0" distL="0" distR="0" wp14:anchorId="4F60D630" wp14:editId="5105D3B1">
             <wp:extent cx="2352675" cy="2286000"/>
             <wp:effectExtent l="0" t="0" r="9525" b="0"/>
             <wp:docPr id="8" name="Picture 8"/>
@@ -543,21 +533,7 @@
         <w:rPr>
           <w:color w:val="000000"/>
         </w:rPr>
-        <w:t>In the dialog window, name the new environment “</w:t>
-      </w:r>
-      <w:proofErr w:type="spellStart"/>
-      <w:r>
-        <w:rPr>
-          <w:color w:val="000000"/>
-        </w:rPr>
-        <w:t>ketos-env</w:t>
-      </w:r>
-      <w:proofErr w:type="spellEnd"/>
-      <w:r>
-        <w:rPr>
-          <w:color w:val="000000"/>
-        </w:rPr>
-        <w:t>”, select python 3.9, then click the “</w:t>
+        <w:t>In the dialog window, name the new environment “ketos-env”, select python 3.9, then click the “</w:t>
       </w:r>
       <w:proofErr w:type="gramStart"/>
       <w:r>
@@ -593,27 +569,7 @@
         <w:rPr>
           <w:color w:val="000000"/>
         </w:rPr>
-        <w:t>After a few seconds the environ</w:t>
-      </w:r>
-      <w:r>
-        <w:rPr>
-          <w:color w:val="000000"/>
-        </w:rPr>
-        <w:t>ment “</w:t>
-      </w:r>
-      <w:proofErr w:type="spellStart"/>
-      <w:r>
-        <w:rPr>
-          <w:color w:val="000000"/>
-        </w:rPr>
-        <w:t>ketos-env</w:t>
-      </w:r>
-      <w:proofErr w:type="spellEnd"/>
-      <w:r>
-        <w:rPr>
-          <w:color w:val="000000"/>
-        </w:rPr>
-        <w:t>” will appear in the list of environments in Anaconda Navigator (4)</w:t>
+        <w:t>After a few seconds the environment “ketos-env” will appear in the list of environments in Anaconda Navigator (4)</w:t>
       </w:r>
       <w:r>
         <w:rPr>
@@ -627,7 +583,7 @@
           <w:color w:val="000000"/>
         </w:rPr>
         <w:drawing>
-          <wp:inline distT="0" distB="0" distL="0" distR="0">
+          <wp:inline distT="0" distB="0" distL="0" distR="0" wp14:anchorId="6797087D" wp14:editId="282D7F6D">
             <wp:extent cx="5052130" cy="3232521"/>
             <wp:effectExtent l="0" t="0" r="0" b="0"/>
             <wp:docPr id="3" name="image1.png"/>
@@ -720,21 +676,7 @@
         <w:rPr>
           <w:color w:val="000000"/>
         </w:rPr>
-        <w:t>Click the green button on the right side of the “</w:t>
-      </w:r>
-      <w:proofErr w:type="spellStart"/>
-      <w:r>
-        <w:rPr>
-          <w:color w:val="000000"/>
-        </w:rPr>
-        <w:t>ketos-env</w:t>
-      </w:r>
-      <w:proofErr w:type="spellEnd"/>
-      <w:r>
-        <w:rPr>
-          <w:color w:val="000000"/>
-        </w:rPr>
-        <w:t>” environment (1)</w:t>
+        <w:t>Click the green button on the right side of the “ketos-env” environment (1)</w:t>
       </w:r>
     </w:p>
     <w:p>
@@ -756,13 +698,7 @@
         <w:rPr>
           <w:color w:val="000000"/>
         </w:rPr>
-        <w:t>Select “Open Terminal” (2) and a termina</w:t>
-      </w:r>
-      <w:r>
-        <w:rPr>
-          <w:color w:val="000000"/>
-        </w:rPr>
-        <w:t>l window will open (3)</w:t>
+        <w:t>Select “Open Terminal” (2) and a terminal window will open (3)</w:t>
       </w:r>
       <w:r>
         <w:rPr>
@@ -776,7 +712,7 @@
           <w:color w:val="000000"/>
         </w:rPr>
         <w:drawing>
-          <wp:inline distT="0" distB="0" distL="0" distR="0">
+          <wp:inline distT="0" distB="0" distL="0" distR="0" wp14:anchorId="747E2E2B" wp14:editId="27BE22F4">
             <wp:extent cx="4958337" cy="3163654"/>
             <wp:effectExtent l="0" t="0" r="0" b="0"/>
             <wp:docPr id="2" name="image2.png"/>
@@ -870,129 +806,78 @@
           <w:b/>
           <w:i/>
         </w:rPr>
-        <w:t>cd &lt;main-</w:t>
-      </w:r>
-      <w:proofErr w:type="spellStart"/>
+        <w:t>cd &lt;main-minke-detector-folder&gt;</w:t>
+      </w:r>
       <w:r>
         <w:rPr>
           <w:b/>
           <w:i/>
         </w:rPr>
-        <w:t>minke</w:t>
-      </w:r>
-      <w:proofErr w:type="spellEnd"/>
+        <w:t xml:space="preserve"> </w:t>
+      </w:r>
       <w:r>
         <w:rPr>
           <w:b/>
           <w:i/>
         </w:rPr>
-        <w:t>-detector-folder&gt;</w:t>
+        <w:br/>
+      </w:r>
+      <w:r>
+        <w:t xml:space="preserve">where &lt;main-minke-detector-folder&gt; is the path of the main minke detector folder (i.e. step 2d). In my case I type:  </w:t>
       </w:r>
       <w:r>
         <w:rPr>
           <w:b/>
           <w:i/>
         </w:rPr>
-        <w:t xml:space="preserve"> </w:t>
-      </w:r>
-      <w:r>
+        <w:t>cd F:\NOAA_Laptop_backup\2024-08-12\Documents\GitHub\minke-whale-detector</w:t>
+      </w:r>
+    </w:p>
+    <w:p>
+      <w:pPr>
+        <w:pBdr>
+          <w:top w:val="nil"/>
+          <w:left w:val="nil"/>
+          <w:bottom w:val="nil"/>
+          <w:right w:val="nil"/>
+          <w:between w:val="nil"/>
+        </w:pBdr>
+        <w:shd w:val="clear" w:color="auto" w:fill="FFFFFF"/>
+        <w:spacing w:after="0"/>
+        <w:ind w:left="1440"/>
         <w:rPr>
           <w:b/>
           <w:i/>
-        </w:rPr>
-        <w:br/>
-      </w:r>
-      <w:r>
-        <w:t xml:space="preserve">where </w:t>
-      </w:r>
-      <w:r>
-        <w:t>&lt;main-</w:t>
-      </w:r>
-      <w:proofErr w:type="spellStart"/>
-      <w:r>
-        <w:t>minke</w:t>
-      </w:r>
-      <w:proofErr w:type="spellEnd"/>
-      <w:r>
-        <w:t>-detector-folder&gt;</w:t>
-      </w:r>
-      <w:r>
-        <w:t xml:space="preserve"> is the path of the main </w:t>
-      </w:r>
-      <w:proofErr w:type="spellStart"/>
-      <w:r>
-        <w:t>minke</w:t>
-      </w:r>
-      <w:proofErr w:type="spellEnd"/>
-      <w:r>
-        <w:t xml:space="preserve"> detector folder (i.e. step 2d). In my case I type:  </w:t>
-      </w:r>
-      <w:r>
+          <w:color w:val="000000"/>
+        </w:rPr>
+      </w:pPr>
+    </w:p>
+    <w:p>
+      <w:pPr>
+        <w:numPr>
+          <w:ilvl w:val="1"/>
+          <w:numId w:val="4"/>
+        </w:numPr>
+        <w:pBdr>
+          <w:top w:val="nil"/>
+          <w:left w:val="nil"/>
+          <w:bottom w:val="nil"/>
+          <w:right w:val="nil"/>
+          <w:between w:val="nil"/>
+        </w:pBdr>
+        <w:shd w:val="clear" w:color="auto" w:fill="FFFFFF"/>
+        <w:spacing w:after="0"/>
         <w:rPr>
           <w:b/>
           <w:i/>
-        </w:rPr>
-        <w:t xml:space="preserve">cd </w:t>
-      </w:r>
-      <w:r>
-        <w:rPr>
-          <w:b/>
-          <w:i/>
-        </w:rPr>
-        <w:t>F:\NOAA_Laptop_backup\2024-08-12\Documents\GitHub\minke-whale-detector</w:t>
-      </w:r>
-    </w:p>
-    <w:p>
-      <w:pPr>
-        <w:pBdr>
-          <w:top w:val="nil"/>
-          <w:left w:val="nil"/>
-          <w:bottom w:val="nil"/>
-          <w:right w:val="nil"/>
-          <w:between w:val="nil"/>
-        </w:pBdr>
-        <w:shd w:val="clear" w:color="auto" w:fill="FFFFFF"/>
-        <w:spacing w:after="0"/>
-        <w:ind w:left="1440"/>
-        <w:rPr>
-          <w:b/>
-          <w:i/>
-          <w:color w:val="000000"/>
-        </w:rPr>
-      </w:pPr>
-    </w:p>
-    <w:p>
-      <w:pPr>
-        <w:numPr>
-          <w:ilvl w:val="1"/>
-          <w:numId w:val="4"/>
-        </w:numPr>
-        <w:pBdr>
-          <w:top w:val="nil"/>
-          <w:left w:val="nil"/>
-          <w:bottom w:val="nil"/>
-          <w:right w:val="nil"/>
-          <w:between w:val="nil"/>
-        </w:pBdr>
-        <w:shd w:val="clear" w:color="auto" w:fill="FFFFFF"/>
-        <w:spacing w:after="0"/>
-        <w:rPr>
-          <w:b/>
-          <w:i/>
-          <w:color w:val="000000"/>
-        </w:rPr>
-      </w:pPr>
-      <w:r>
-        <w:rPr>
-          <w:color w:val="000000"/>
-        </w:rPr>
-        <w:t>In the terminal window, type</w:t>
-      </w:r>
-      <w:r>
-        <w:rPr>
-          <w:color w:val="000000"/>
-        </w:rPr>
-        <w:t xml:space="preserve">: </w:t>
+          <w:color w:val="000000"/>
+        </w:rPr>
+      </w:pPr>
+      <w:r>
+        <w:rPr>
+          <w:color w:val="000000"/>
+        </w:rPr>
+        <w:t xml:space="preserve">In the terminal window, type: </w:t>
       </w:r>
       <w:r>
         <w:rPr>
@@ -1050,8 +935,6 @@
         </w:rPr>
         <w:t>Running the detector</w:t>
       </w:r>
-      <w:bookmarkStart w:id="1" w:name="_GoBack"/>
-      <w:bookmarkEnd w:id="1"/>
     </w:p>
     <w:p>
       <w:pPr>
@@ -1158,7 +1041,7 @@
           <w:color w:val="000000"/>
         </w:rPr>
         <w:drawing>
-          <wp:inline distT="0" distB="0" distL="0" distR="0">
+          <wp:inline distT="0" distB="0" distL="0" distR="0" wp14:anchorId="444FC3E1" wp14:editId="431A7564">
             <wp:extent cx="5068790" cy="2528980"/>
             <wp:effectExtent l="0" t="0" r="0" b="0"/>
             <wp:docPr id="5" name="image3.png"/>
@@ -1213,13 +1096,7 @@
         <w:rPr>
           <w:color w:val="000000"/>
         </w:rPr>
-        <w:t>Edit the file and change the different parameters required. The first section of the file (“data info”) needs to be change for each deployment. The second section is specific to the location of the detector on your machine and of the threshold to use. Cons</w:t>
-      </w:r>
-      <w:r>
-        <w:rPr>
-          <w:color w:val="000000"/>
-        </w:rPr>
-        <w:t>equently this section will most likely only need to be edited the first time you use the detector and can be kept the same thereafter. The last section of the file does not need to be edited.</w:t>
+        <w:t>Edit the file and change the different parameters required. The first section of the file (“data info”) needs to be change for each deployment. The second section is specific to the location of the detector on your machine and of the threshold to use. Consequently this section will most likely only need to be edited the first time you use the detector and can be kept the same thereafter. The last section of the file does not need to be edited.</w:t>
       </w:r>
     </w:p>
     <w:p>
@@ -1279,13 +1156,7 @@
         <w:rPr>
           <w:color w:val="000000"/>
         </w:rPr>
-        <w:t>AUDIO_DI</w:t>
-      </w:r>
-      <w:r>
-        <w:rPr>
-          <w:color w:val="000000"/>
-        </w:rPr>
-        <w:t>R: Path of the audio data to analyze. Any subfolders will also be analyzed.</w:t>
+        <w:t>AUDIO_DIR: Path of the audio data to analyze. Any subfolders will also be analyzed.</w:t>
       </w:r>
     </w:p>
     <w:p>
@@ -1351,13 +1222,7 @@
         <w:rPr>
           <w:color w:val="000000"/>
         </w:rPr>
-        <w:t>RECORDING_ID: A unique ID for the deployment being analyzed (</w:t>
-      </w:r>
-      <w:r>
-        <w:rPr>
-          <w:color w:val="000000"/>
-        </w:rPr>
-        <w:t>e.g., UK-SAMS-N1-20201102).</w:t>
+        <w:t>RECORDING_ID: A unique ID for the deployment being analyzed (e.g., UK-SAMS-N1-20201102).</w:t>
       </w:r>
     </w:p>
     <w:p>
@@ -1379,7 +1244,6 @@
         <w:rPr>
           <w:color w:val="000000"/>
         </w:rPr>
-        <w:lastRenderedPageBreak/>
         <w:t>OUTPUT_DIR: Path of the folder where the detection results will be saved. If the folder does not exist, it will be automatically created.</w:t>
       </w:r>
     </w:p>
@@ -1401,13 +1265,8 @@
         <w:rPr>
           <w:color w:val="000000"/>
         </w:rPr>
-        <w:t xml:space="preserve">SUMMARY_TIME_OFFSET: Time offset (in hours) to use for the daily detection summaries. Can be positive or negative number. For example, it would need to be set to -5 to obtain daily summaries in local time for data collected in Cape Cod and recorded with a </w:t>
-      </w:r>
-      <w:r>
-        <w:rPr>
-          <w:color w:val="000000"/>
-        </w:rPr>
-        <w:t>UTC timestamp.</w:t>
+        <w:lastRenderedPageBreak/>
+        <w:t>SUMMARY_TIME_OFFSET: Time offset (in hours) to use for the daily detection summaries. Can be positive or negative number. For example, it would need to be set to -5 to obtain daily summaries in local time for data collected in Cape Cod and recorded with a UTC timestamp.</w:t>
       </w:r>
     </w:p>
     <w:p>
@@ -1475,14 +1334,12 @@
         </w:rPr>
         <w:t xml:space="preserve">MODEL: Path of the classification model to use. Models ate the files </w:t>
       </w:r>
-      <w:proofErr w:type="spellStart"/>
-      <w:r>
-        <w:rPr>
-          <w:color w:val="000000"/>
-        </w:rPr>
-        <w:t>ketos_model.kt</w:t>
-      </w:r>
-      <w:proofErr w:type="spellEnd"/>
+      <w:r>
+        <w:rPr>
+          <w:color w:val="000000"/>
+        </w:rPr>
+        <w:t>model_NAMW_20240523.kt</w:t>
+      </w:r>
       <w:r>
         <w:rPr>
           <w:color w:val="000000"/>
@@ -1523,13 +1380,7 @@
         <w:rPr>
           <w:color w:val="000000"/>
         </w:rPr>
-        <w:t>MIN_CO</w:t>
-      </w:r>
-      <w:r>
-        <w:rPr>
-          <w:color w:val="000000"/>
-        </w:rPr>
-        <w:t>NFIDENCE: Minimum confidence threshold for detections. Values between 0 and 1.</w:t>
+        <w:t>MIN_CONFIDENCE: Minimum confidence threshold for detections. Values between 0 and 1.</w:t>
       </w:r>
     </w:p>
     <w:p>
@@ -1551,13 +1402,7 @@
         <w:rPr>
           <w:color w:val="000000"/>
         </w:rPr>
-        <w:t>BATCH_SIZE: Number of spectrogram snippets to process at the same time. Large values will make the processing faster but may cause memory issues. Suggest starting high (e.g. 102</w:t>
-      </w:r>
-      <w:r>
-        <w:rPr>
-          <w:color w:val="000000"/>
-        </w:rPr>
-        <w:t>4), and decrease progressively if memory errors occur (e.g., 512, 256, etc.)</w:t>
+        <w:t>BATCH_SIZE: Number of spectrogram snippets to process at the same time. Large values will make the processing faster but may cause memory issues. Suggest starting high (e.g. 1024), and decrease progressively if memory errors occur (e.g., 512, 256, etc.)</w:t>
       </w:r>
     </w:p>
     <w:p>
@@ -1617,21 +1462,7 @@
         <w:rPr>
           <w:color w:val="000000"/>
         </w:rPr>
-        <w:t>In Anaconda Navigator, click the green button on the right side of the “</w:t>
-      </w:r>
-      <w:proofErr w:type="spellStart"/>
-      <w:r>
-        <w:rPr>
-          <w:color w:val="000000"/>
-        </w:rPr>
-        <w:t>ketos-env</w:t>
-      </w:r>
-      <w:proofErr w:type="spellEnd"/>
-      <w:r>
-        <w:rPr>
-          <w:color w:val="000000"/>
-        </w:rPr>
-        <w:t>” environment (1), select “Open Terminal” (2) and a terminal window will open (3)</w:t>
+        <w:t>In Anaconda Navigator, click the green button on the right side of the “ketos-env” environment (1), select “Open Terminal” (2) and a terminal window will open (3)</w:t>
       </w:r>
       <w:r>
         <w:rPr>
@@ -1645,7 +1476,7 @@
           <w:color w:val="000000"/>
         </w:rPr>
         <w:drawing>
-          <wp:inline distT="0" distB="0" distL="0" distR="0">
+          <wp:inline distT="0" distB="0" distL="0" distR="0" wp14:anchorId="69165152" wp14:editId="183AA862">
             <wp:extent cx="5321987" cy="3395679"/>
             <wp:effectExtent l="0" t="0" r="0" b="0"/>
             <wp:docPr id="4" name="image2.png"/>
@@ -1742,7 +1573,6 @@
         <w:rPr>
           <w:color w:val="000000"/>
         </w:rPr>
-        <w:lastRenderedPageBreak/>
         <w:t xml:space="preserve">Type the name of the .bat file to run. For example: </w:t>
       </w:r>
       <w:r>
@@ -1771,16 +1601,9 @@
         <w:rPr>
           <w:color w:val="000000"/>
         </w:rPr>
-        <w:t>The processing will start and the results will be save in the OUTPUT_DIR folder defined in the .bat fil</w:t>
-      </w:r>
-      <w:r>
-        <w:rPr>
-          <w:color w:val="000000"/>
-        </w:rPr>
-        <w:t>e.</w:t>
-      </w:r>
-    </w:p>
-    <w:p/>
+        <w:t>The processing will start and the results will be save in the OUTPUT_DIR folder defined in the .bat file.</w:t>
+      </w:r>
+    </w:p>
     <w:sectPr>
       <w:pgSz w:w="12240" w:h="15840"/>
       <w:pgMar w:top="1440" w:right="1440" w:bottom="1440" w:left="1440" w:header="720" w:footer="720" w:gutter="0"/>
@@ -1792,7 +1615,7 @@
 </file>
 
 <file path=word/numbering.xml><?xml version="1.0" encoding="utf-8"?>
-<w:numbering xmlns:wpc="http://schemas.microsoft.com/office/word/2010/wordprocessingCanvas" xmlns:cx="http://schemas.microsoft.com/office/drawing/2014/chartex" xmlns:cx1="http://schemas.microsoft.com/office/drawing/2015/9/8/chartex" xmlns:mc="http://schemas.openxmlformats.org/markup-compatibility/2006" xmlns:o="urn:schemas-microsoft-com:office:office" xmlns:r="http://schemas.openxmlformats.org/officeDocument/2006/relationships" xmlns:m="http://schemas.openxmlformats.org/officeDocument/2006/math" xmlns:v="urn:schemas-microsoft-com:vml" xmlns:wp14="http://schemas.microsoft.com/office/word/2010/wordprocessingDrawing" xmlns:wp="http://schemas.openxmlformats.org/drawingml/2006/wordprocessingDrawing" xmlns:w10="urn:schemas-microsoft-com:office:word" xmlns:w="http://schemas.openxmlformats.org/wordprocessingml/2006/main" xmlns:w14="http://schemas.microsoft.com/office/word/2010/wordml" xmlns:w15="http://schemas.microsoft.com/office/word/2012/wordml" xmlns:w16se="http://schemas.microsoft.com/office/word/2015/wordml/symex" xmlns:wpg="http://schemas.microsoft.com/office/word/2010/wordprocessingGroup" xmlns:wpi="http://schemas.microsoft.com/office/word/2010/wordprocessingInk" xmlns:wne="http://schemas.microsoft.com/office/word/2006/wordml" xmlns:wps="http://schemas.microsoft.com/office/word/2010/wordprocessingShape" mc:Ignorable="w14 w15 w16se wp14">
+<w:numbering xmlns:wpc="http://schemas.microsoft.com/office/word/2010/wordprocessingCanvas" xmlns:cx="http://schemas.microsoft.com/office/drawing/2014/chartex" xmlns:cx1="http://schemas.microsoft.com/office/drawing/2015/9/8/chartex" xmlns:cx2="http://schemas.microsoft.com/office/drawing/2015/10/21/chartex" xmlns:cx3="http://schemas.microsoft.com/office/drawing/2016/5/9/chartex" xmlns:cx4="http://schemas.microsoft.com/office/drawing/2016/5/10/chartex" xmlns:cx5="http://schemas.microsoft.com/office/drawing/2016/5/11/chartex" xmlns:cx6="http://schemas.microsoft.com/office/drawing/2016/5/12/chartex" xmlns:cx7="http://schemas.microsoft.com/office/drawing/2016/5/13/chartex" xmlns:cx8="http://schemas.microsoft.com/office/drawing/2016/5/14/chartex" xmlns:mc="http://schemas.openxmlformats.org/markup-compatibility/2006" xmlns:aink="http://schemas.microsoft.com/office/drawing/2016/ink" xmlns:am3d="http://schemas.microsoft.com/office/drawing/2017/model3d" xmlns:o="urn:schemas-microsoft-com:office:office" xmlns:oel="http://schemas.microsoft.com/office/2019/extlst" xmlns:r="http://schemas.openxmlformats.org/officeDocument/2006/relationships" xmlns:m="http://schemas.openxmlformats.org/officeDocument/2006/math" xmlns:v="urn:schemas-microsoft-com:vml" xmlns:wp14="http://schemas.microsoft.com/office/word/2010/wordprocessingDrawing" xmlns:wp="http://schemas.openxmlformats.org/drawingml/2006/wordprocessingDrawing" xmlns:w10="urn:schemas-microsoft-com:office:word" xmlns:w="http://schemas.openxmlformats.org/wordprocessingml/2006/main" xmlns:w14="http://schemas.microsoft.com/office/word/2010/wordml" xmlns:w15="http://schemas.microsoft.com/office/word/2012/wordml" xmlns:w16cex="http://schemas.microsoft.com/office/word/2018/wordml/cex" xmlns:w16cid="http://schemas.microsoft.com/office/word/2016/wordml/cid" xmlns:w16="http://schemas.microsoft.com/office/word/2018/wordml" xmlns:w16du="http://schemas.microsoft.com/office/word/2023/wordml/word16du" xmlns:w16sdtdh="http://schemas.microsoft.com/office/word/2020/wordml/sdtdatahash" xmlns:w16se="http://schemas.microsoft.com/office/word/2015/wordml/symex" xmlns:wpg="http://schemas.microsoft.com/office/word/2010/wordprocessingGroup" xmlns:wpi="http://schemas.microsoft.com/office/word/2010/wordprocessingInk" xmlns:wne="http://schemas.microsoft.com/office/word/2006/wordml" xmlns:wps="http://schemas.microsoft.com/office/word/2010/wordprocessingShape" mc:Ignorable="w14 w15 w16se w16cid w16 w16cex w16sdtdh w16du wp14">
   <w:abstractNum w:abstractNumId="0" w15:restartNumberingAfterBreak="0">
     <w:nsid w:val="002D5FA4"/>
     <w:multiLevelType w:val="multilevel"/>
@@ -2191,23 +2014,23 @@
       </w:rPr>
     </w:lvl>
   </w:abstractNum>
-  <w:num w:numId="1">
+  <w:num w:numId="1" w16cid:durableId="1083726266">
     <w:abstractNumId w:val="2"/>
   </w:num>
-  <w:num w:numId="2">
+  <w:num w:numId="2" w16cid:durableId="1816676599">
     <w:abstractNumId w:val="3"/>
   </w:num>
-  <w:num w:numId="3">
+  <w:num w:numId="3" w16cid:durableId="1665469514">
     <w:abstractNumId w:val="0"/>
   </w:num>
-  <w:num w:numId="4">
+  <w:num w:numId="4" w16cid:durableId="234439743">
     <w:abstractNumId w:val="1"/>
   </w:num>
 </w:numbering>
 </file>
 
 <file path=word/styles.xml><?xml version="1.0" encoding="utf-8"?>
-<w:styles xmlns:mc="http://schemas.openxmlformats.org/markup-compatibility/2006" xmlns:r="http://schemas.openxmlformats.org/officeDocument/2006/relationships" xmlns:w="http://schemas.openxmlformats.org/wordprocessingml/2006/main" xmlns:w14="http://schemas.microsoft.com/office/word/2010/wordml" xmlns:w15="http://schemas.microsoft.com/office/word/2012/wordml" xmlns:w16se="http://schemas.microsoft.com/office/word/2015/wordml/symex" mc:Ignorable="w14 w15 w16se">
+<w:styles xmlns:mc="http://schemas.openxmlformats.org/markup-compatibility/2006" xmlns:r="http://schemas.openxmlformats.org/officeDocument/2006/relationships" xmlns:w="http://schemas.openxmlformats.org/wordprocessingml/2006/main" xmlns:w14="http://schemas.microsoft.com/office/word/2010/wordml" xmlns:w15="http://schemas.microsoft.com/office/word/2012/wordml" xmlns:w16cex="http://schemas.microsoft.com/office/word/2018/wordml/cex" xmlns:w16cid="http://schemas.microsoft.com/office/word/2016/wordml/cid" xmlns:w16="http://schemas.microsoft.com/office/word/2018/wordml" xmlns:w16du="http://schemas.microsoft.com/office/word/2023/wordml/word16du" xmlns:w16sdtdh="http://schemas.microsoft.com/office/word/2020/wordml/sdtdatahash" xmlns:w16se="http://schemas.microsoft.com/office/word/2015/wordml/symex" mc:Ignorable="w14 w15 w16se w16cid w16 w16cex w16sdtdh w16du">
   <w:docDefaults>
     <w:rPrDefault>
       <w:rPr>
@@ -2223,7 +2046,7 @@
       </w:pPr>
     </w:pPrDefault>
   </w:docDefaults>
-  <w:latentStyles w:defLockedState="0" w:defUIPriority="99" w:defSemiHidden="0" w:defUnhideWhenUsed="0" w:defQFormat="0" w:count="371">
+  <w:latentStyles w:defLockedState="0" w:defUIPriority="99" w:defSemiHidden="0" w:defUnhideWhenUsed="0" w:defQFormat="0" w:count="376">
     <w:lsdException w:name="Normal" w:uiPriority="0" w:qFormat="1"/>
     <w:lsdException w:name="heading 1" w:uiPriority="9" w:qFormat="1"/>
     <w:lsdException w:name="heading 2" w:semiHidden="1" w:uiPriority="9" w:unhideWhenUsed="1" w:qFormat="1"/>
@@ -2595,6 +2418,11 @@
     <w:lsdException w:name="List Table 5 Dark Accent 6" w:uiPriority="50"/>
     <w:lsdException w:name="List Table 6 Colorful Accent 6" w:uiPriority="51"/>
     <w:lsdException w:name="List Table 7 Colorful Accent 6" w:uiPriority="52"/>
+    <w:lsdException w:name="Mention" w:semiHidden="1" w:unhideWhenUsed="1"/>
+    <w:lsdException w:name="Smart Hyperlink" w:semiHidden="1" w:unhideWhenUsed="1"/>
+    <w:lsdException w:name="Hashtag" w:semiHidden="1" w:unhideWhenUsed="1"/>
+    <w:lsdException w:name="Unresolved Mention" w:semiHidden="1" w:unhideWhenUsed="1"/>
+    <w:lsdException w:name="Smart Link" w:semiHidden="1" w:unhideWhenUsed="1"/>
   </w:latentStyles>
   <w:style w:type="paragraph" w:default="1" w:styleId="Normal">
     <w:name w:val="Normal"/>

</xml_diff>